<commit_message>
Docs: add warehouse role to admin guide (v1.2) and sysadmin overview (v1.1)
Co-Authored-By: Claude Fable 5 <noreply@anthropic.com>
</commit_message>
<xml_diff>
--- a/docs/Prometheus-Role-Structure-SysAdmin-Overview.docx
+++ b/docs/Prometheus-Role-Structure-SysAdmin-Overview.docx
@@ -54,7 +54,7 @@
           <w:sz w:val="20"/>
           <w:szCs w:val="20"/>
         </w:rPr>
-        <w:t>Version 1.0 · July 2026</w:t>
+        <w:t>Version 1.1 · July 2026</w:t>
       </w:r>
     </w:p>
     <w:p>
@@ -66,9 +66,8 @@
       <w:pPr>
         <w:pStyle w:val="Heading1"/>
       </w:pPr>
-      <w:bookmarkStart w:id="0" w:name="_Toc234510987"/>
-      <w:r>
-        <w:lastRenderedPageBreak/>
+      <w:bookmarkStart w:id="0" w:name="_Toc234579184"/>
+      <w:r>
         <w:t>Contents</w:t>
       </w:r>
       <w:bookmarkEnd w:id="0"/>
@@ -76,7 +75,7 @@
     <w:sdt>
       <w:sdtPr>
         <w:alias w:val="Table of Contents"/>
-        <w:id w:val="-446169315"/>
+        <w:id w:val="1722396701"/>
       </w:sdtPr>
       <w:sdtEndPr/>
       <w:sdtContent>
@@ -104,7 +103,7 @@
           <w:r>
             <w:fldChar w:fldCharType="separate"/>
           </w:r>
-          <w:hyperlink w:anchor="_Toc234510987" w:history="1">
+          <w:hyperlink w:anchor="_Toc234579184" w:history="1">
             <w:r>
               <w:rPr>
                 <w:rStyle w:val="Hyperlink"/>
@@ -128,7 +127,7 @@
               <w:rPr>
                 <w:noProof/>
               </w:rPr>
-              <w:instrText xml:space="preserve"> PAGEREF _Toc234510987 \h </w:instrText>
+              <w:instrText xml:space="preserve"> PAGEREF _Toc234579184 \h </w:instrText>
             </w:r>
             <w:r>
               <w:rPr>
@@ -170,7 +169,7 @@
               <w14:ligatures w14:val="standardContextual"/>
             </w:rPr>
           </w:pPr>
-          <w:hyperlink w:anchor="_Toc234510988" w:history="1">
+          <w:hyperlink w:anchor="_Toc234579185" w:history="1">
             <w:r>
               <w:rPr>
                 <w:rStyle w:val="Hyperlink"/>
@@ -194,7 +193,7 @@
               <w:rPr>
                 <w:noProof/>
               </w:rPr>
-              <w:instrText xml:space="preserve"> PAGEREF _Toc234510988 \h </w:instrText>
+              <w:instrText xml:space="preserve"> PAGEREF _Toc234579185 \h </w:instrText>
             </w:r>
             <w:r>
               <w:rPr>
@@ -236,13 +235,13 @@
               <w14:ligatures w14:val="standardContextual"/>
             </w:rPr>
           </w:pPr>
-          <w:hyperlink w:anchor="_Toc234510989" w:history="1">
+          <w:hyperlink w:anchor="_Toc234579186" w:history="1">
             <w:r>
               <w:rPr>
                 <w:rStyle w:val="Hyperlink"/>
                 <w:noProof/>
               </w:rPr>
-              <w:t>2. The Five Roles</w:t>
+              <w:t>2. The Six Roles</w:t>
             </w:r>
             <w:r>
               <w:rPr>
@@ -260,7 +259,7 @@
               <w:rPr>
                 <w:noProof/>
               </w:rPr>
-              <w:instrText xml:space="preserve"> PAGEREF _Toc234510989 \h </w:instrText>
+              <w:instrText xml:space="preserve"> PAGEREF _Toc234579186 \h </w:instrText>
             </w:r>
             <w:r>
               <w:rPr>
@@ -302,7 +301,7 @@
               <w14:ligatures w14:val="standardContextual"/>
             </w:rPr>
           </w:pPr>
-          <w:hyperlink w:anchor="_Toc234510990" w:history="1">
+          <w:hyperlink w:anchor="_Toc234579187" w:history="1">
             <w:r>
               <w:rPr>
                 <w:rStyle w:val="Hyperlink"/>
@@ -326,7 +325,7 @@
               <w:rPr>
                 <w:noProof/>
               </w:rPr>
-              <w:instrText xml:space="preserve"> PAGEREF _Toc234510990 \h </w:instrText>
+              <w:instrText xml:space="preserve"> PAGEREF _Toc234579187 \h </w:instrText>
             </w:r>
             <w:r>
               <w:rPr>
@@ -343,7 +342,7 @@
               <w:rPr>
                 <w:noProof/>
               </w:rPr>
-              <w:t>3</w:t>
+              <w:t>4</w:t>
             </w:r>
             <w:r>
               <w:rPr>
@@ -368,7 +367,7 @@
               <w14:ligatures w14:val="standardContextual"/>
             </w:rPr>
           </w:pPr>
-          <w:hyperlink w:anchor="_Toc234510991" w:history="1">
+          <w:hyperlink w:anchor="_Toc234579188" w:history="1">
             <w:r>
               <w:rPr>
                 <w:rStyle w:val="Hyperlink"/>
@@ -392,7 +391,7 @@
               <w:rPr>
                 <w:noProof/>
               </w:rPr>
-              <w:instrText xml:space="preserve"> PAGEREF _Toc234510991 \h </w:instrText>
+              <w:instrText xml:space="preserve"> PAGEREF _Toc234579188 \h </w:instrText>
             </w:r>
             <w:r>
               <w:rPr>
@@ -409,7 +408,7 @@
               <w:rPr>
                 <w:noProof/>
               </w:rPr>
-              <w:t>4</w:t>
+              <w:t>5</w:t>
             </w:r>
             <w:r>
               <w:rPr>
@@ -434,7 +433,7 @@
               <w14:ligatures w14:val="standardContextual"/>
             </w:rPr>
           </w:pPr>
-          <w:hyperlink w:anchor="_Toc234510992" w:history="1">
+          <w:hyperlink w:anchor="_Toc234579189" w:history="1">
             <w:r>
               <w:rPr>
                 <w:rStyle w:val="Hyperlink"/>
@@ -458,7 +457,7 @@
               <w:rPr>
                 <w:noProof/>
               </w:rPr>
-              <w:instrText xml:space="preserve"> PAGEREF _Toc234510992 \h </w:instrText>
+              <w:instrText xml:space="preserve"> PAGEREF _Toc234579189 \h </w:instrText>
             </w:r>
             <w:r>
               <w:rPr>
@@ -475,7 +474,7 @@
               <w:rPr>
                 <w:noProof/>
               </w:rPr>
-              <w:t>4</w:t>
+              <w:t>5</w:t>
             </w:r>
             <w:r>
               <w:rPr>
@@ -500,7 +499,7 @@
               <w14:ligatures w14:val="standardContextual"/>
             </w:rPr>
           </w:pPr>
-          <w:hyperlink w:anchor="_Toc234510993" w:history="1">
+          <w:hyperlink w:anchor="_Toc234579190" w:history="1">
             <w:r>
               <w:rPr>
                 <w:rStyle w:val="Hyperlink"/>
@@ -524,7 +523,7 @@
               <w:rPr>
                 <w:noProof/>
               </w:rPr>
-              <w:instrText xml:space="preserve"> PAGEREF _Toc234510993 \h </w:instrText>
+              <w:instrText xml:space="preserve"> PAGEREF _Toc234579190 \h </w:instrText>
             </w:r>
             <w:r>
               <w:rPr>
@@ -566,7 +565,7 @@
               <w14:ligatures w14:val="standardContextual"/>
             </w:rPr>
           </w:pPr>
-          <w:hyperlink w:anchor="_Toc234510994" w:history="1">
+          <w:hyperlink w:anchor="_Toc234579191" w:history="1">
             <w:r>
               <w:rPr>
                 <w:rStyle w:val="Hyperlink"/>
@@ -590,7 +589,7 @@
               <w:rPr>
                 <w:noProof/>
               </w:rPr>
-              <w:instrText xml:space="preserve"> PAGEREF _Toc234510994 \h </w:instrText>
+              <w:instrText xml:space="preserve"> PAGEREF _Toc234579191 \h </w:instrText>
             </w:r>
             <w:r>
               <w:rPr>
@@ -632,7 +631,7 @@
               <w14:ligatures w14:val="standardContextual"/>
             </w:rPr>
           </w:pPr>
-          <w:hyperlink w:anchor="_Toc234510995" w:history="1">
+          <w:hyperlink w:anchor="_Toc234579192" w:history="1">
             <w:r>
               <w:rPr>
                 <w:rStyle w:val="Hyperlink"/>
@@ -656,7 +655,7 @@
               <w:rPr>
                 <w:noProof/>
               </w:rPr>
-              <w:instrText xml:space="preserve"> PAGEREF _Toc234510995 \h </w:instrText>
+              <w:instrText xml:space="preserve"> PAGEREF _Toc234579192 \h </w:instrText>
             </w:r>
             <w:r>
               <w:rPr>
@@ -673,7 +672,7 @@
               <w:rPr>
                 <w:noProof/>
               </w:rPr>
-              <w:t>5</w:t>
+              <w:t>6</w:t>
             </w:r>
             <w:r>
               <w:rPr>
@@ -698,7 +697,7 @@
               <w14:ligatures w14:val="standardContextual"/>
             </w:rPr>
           </w:pPr>
-          <w:hyperlink w:anchor="_Toc234510996" w:history="1">
+          <w:hyperlink w:anchor="_Toc234579193" w:history="1">
             <w:r>
               <w:rPr>
                 <w:rStyle w:val="Hyperlink"/>
@@ -722,7 +721,7 @@
               <w:rPr>
                 <w:noProof/>
               </w:rPr>
-              <w:instrText xml:space="preserve"> PAGEREF _Toc234510996 \h </w:instrText>
+              <w:instrText xml:space="preserve"> PAGEREF _Toc234579193 \h </w:instrText>
             </w:r>
             <w:r>
               <w:rPr>
@@ -739,7 +738,7 @@
               <w:rPr>
                 <w:noProof/>
               </w:rPr>
-              <w:t>5</w:t>
+              <w:t>6</w:t>
             </w:r>
             <w:r>
               <w:rPr>
@@ -764,7 +763,7 @@
               <w14:ligatures w14:val="standardContextual"/>
             </w:rPr>
           </w:pPr>
-          <w:hyperlink w:anchor="_Toc234510997" w:history="1">
+          <w:hyperlink w:anchor="_Toc234579194" w:history="1">
             <w:r>
               <w:rPr>
                 <w:rStyle w:val="Hyperlink"/>
@@ -788,7 +787,7 @@
               <w:rPr>
                 <w:noProof/>
               </w:rPr>
-              <w:instrText xml:space="preserve"> PAGEREF _Toc234510997 \h </w:instrText>
+              <w:instrText xml:space="preserve"> PAGEREF _Toc234579194 \h </w:instrText>
             </w:r>
             <w:r>
               <w:rPr>
@@ -805,7 +804,7 @@
               <w:rPr>
                 <w:noProof/>
               </w:rPr>
-              <w:t>5</w:t>
+              <w:t>6</w:t>
             </w:r>
             <w:r>
               <w:rPr>
@@ -830,7 +829,7 @@
               <w14:ligatures w14:val="standardContextual"/>
             </w:rPr>
           </w:pPr>
-          <w:hyperlink w:anchor="_Toc234510998" w:history="1">
+          <w:hyperlink w:anchor="_Toc234579195" w:history="1">
             <w:r>
               <w:rPr>
                 <w:rStyle w:val="Hyperlink"/>
@@ -854,7 +853,7 @@
               <w:rPr>
                 <w:noProof/>
               </w:rPr>
-              <w:instrText xml:space="preserve"> PAGEREF _Toc234510998 \h </w:instrText>
+              <w:instrText xml:space="preserve"> PAGEREF _Toc234579195 \h </w:instrText>
             </w:r>
             <w:r>
               <w:rPr>
@@ -871,7 +870,7 @@
               <w:rPr>
                 <w:noProof/>
               </w:rPr>
-              <w:t>5</w:t>
+              <w:t>6</w:t>
             </w:r>
             <w:r>
               <w:rPr>
@@ -896,7 +895,7 @@
               <w14:ligatures w14:val="standardContextual"/>
             </w:rPr>
           </w:pPr>
-          <w:hyperlink w:anchor="_Toc234510999" w:history="1">
+          <w:hyperlink w:anchor="_Toc234579196" w:history="1">
             <w:r>
               <w:rPr>
                 <w:rStyle w:val="Hyperlink"/>
@@ -920,7 +919,7 @@
               <w:rPr>
                 <w:noProof/>
               </w:rPr>
-              <w:instrText xml:space="preserve"> PAGEREF _Toc234510999 \h </w:instrText>
+              <w:instrText xml:space="preserve"> PAGEREF _Toc234579196 \h </w:instrText>
             </w:r>
             <w:r>
               <w:rPr>
@@ -962,7 +961,7 @@
               <w14:ligatures w14:val="standardContextual"/>
             </w:rPr>
           </w:pPr>
-          <w:hyperlink w:anchor="_Toc234511000" w:history="1">
+          <w:hyperlink w:anchor="_Toc234579197" w:history="1">
             <w:r>
               <w:rPr>
                 <w:rStyle w:val="Hyperlink"/>
@@ -986,7 +985,7 @@
               <w:rPr>
                 <w:noProof/>
               </w:rPr>
-              <w:instrText xml:space="preserve"> PAGEREF _Toc234511000 \h </w:instrText>
+              <w:instrText xml:space="preserve"> PAGEREF _Toc234579197 \h </w:instrText>
             </w:r>
             <w:r>
               <w:rPr>
@@ -1028,7 +1027,7 @@
               <w14:ligatures w14:val="standardContextual"/>
             </w:rPr>
           </w:pPr>
-          <w:hyperlink w:anchor="_Toc234511001" w:history="1">
+          <w:hyperlink w:anchor="_Toc234579198" w:history="1">
             <w:r>
               <w:rPr>
                 <w:rStyle w:val="Hyperlink"/>
@@ -1052,7 +1051,7 @@
               <w:rPr>
                 <w:noProof/>
               </w:rPr>
-              <w:instrText xml:space="preserve"> PAGEREF _Toc234511001 \h </w:instrText>
+              <w:instrText xml:space="preserve"> PAGEREF _Toc234579198 \h </w:instrText>
             </w:r>
             <w:r>
               <w:rPr>
@@ -1094,7 +1093,7 @@
               <w14:ligatures w14:val="standardContextual"/>
             </w:rPr>
           </w:pPr>
-          <w:hyperlink w:anchor="_Toc234511002" w:history="1">
+          <w:hyperlink w:anchor="_Toc234579199" w:history="1">
             <w:r>
               <w:rPr>
                 <w:rStyle w:val="Hyperlink"/>
@@ -1118,7 +1117,7 @@
               <w:rPr>
                 <w:noProof/>
               </w:rPr>
-              <w:instrText xml:space="preserve"> PAGEREF _Toc234511002 \h </w:instrText>
+              <w:instrText xml:space="preserve"> PAGEREF _Toc234579199 \h </w:instrText>
             </w:r>
             <w:r>
               <w:rPr>
@@ -1135,7 +1134,7 @@
               <w:rPr>
                 <w:noProof/>
               </w:rPr>
-              <w:t>7</w:t>
+              <w:t>8</w:t>
             </w:r>
             <w:r>
               <w:rPr>
@@ -1160,7 +1159,7 @@
               <w14:ligatures w14:val="standardContextual"/>
             </w:rPr>
           </w:pPr>
-          <w:hyperlink w:anchor="_Toc234511003" w:history="1">
+          <w:hyperlink w:anchor="_Toc234579200" w:history="1">
             <w:r>
               <w:rPr>
                 <w:rStyle w:val="Hyperlink"/>
@@ -1184,7 +1183,7 @@
               <w:rPr>
                 <w:noProof/>
               </w:rPr>
-              <w:instrText xml:space="preserve"> PAGEREF _Toc234511003 \h </w:instrText>
+              <w:instrText xml:space="preserve"> PAGEREF _Toc234579200 \h </w:instrText>
             </w:r>
             <w:r>
               <w:rPr>
@@ -1227,9 +1226,8 @@
       <w:pPr>
         <w:pStyle w:val="Heading1"/>
       </w:pPr>
-      <w:bookmarkStart w:id="1" w:name="_Toc234510988"/>
-      <w:r>
-        <w:lastRenderedPageBreak/>
+      <w:bookmarkStart w:id="1" w:name="_Toc234579185"/>
+      <w:r>
         <w:t>1. Identity Model</w:t>
       </w:r>
       <w:bookmarkEnd w:id="1"/>
@@ -1420,9 +1418,9 @@
       <w:pPr>
         <w:pStyle w:val="Heading1"/>
       </w:pPr>
-      <w:bookmarkStart w:id="2" w:name="_Toc234510989"/>
-      <w:r>
-        <w:t>2. The Five Roles</w:t>
+      <w:bookmarkStart w:id="2" w:name="_Toc234579186"/>
+      <w:r>
+        <w:t>2. The Six Roles</w:t>
       </w:r>
       <w:bookmarkEnd w:id="2"/>
     </w:p>
@@ -1938,6 +1936,95 @@
                 <w:sz w:val="20"/>
                 <w:szCs w:val="20"/>
               </w:rPr>
+              <w:t>warehouse</w:t>
+            </w:r>
+          </w:p>
+        </w:tc>
+        <w:tc>
+          <w:tcPr>
+            <w:tcW w:w="4460" w:type="dxa"/>
+            <w:tcBorders>
+              <w:top w:val="single" w:sz="1" w:space="0" w:color="B5C8CD"/>
+              <w:left w:val="single" w:sz="1" w:space="0" w:color="B5C8CD"/>
+              <w:bottom w:val="single" w:sz="1" w:space="0" w:color="B5C8CD"/>
+              <w:right w:val="single" w:sz="1" w:space="0" w:color="B5C8CD"/>
+            </w:tcBorders>
+            <w:tcMar>
+              <w:top w:w="100" w:type="dxa"/>
+              <w:left w:w="140" w:type="dxa"/>
+              <w:bottom w:w="100" w:type="dxa"/>
+              <w:right w:w="140" w:type="dxa"/>
+            </w:tcMar>
+          </w:tcPr>
+          <w:p>
+            <w:r>
+              <w:rPr>
+                <w:sz w:val="20"/>
+                <w:szCs w:val="20"/>
+              </w:rPr>
+              <w:t>Physical operations tier: kanban boards, packaging estimator, supplier catalog, and the warehouse wallboard (role-based entry, no TV password). No sales, pricing, ops-console, or admin surfaces.</w:t>
+            </w:r>
+          </w:p>
+        </w:tc>
+        <w:tc>
+          <w:tcPr>
+            <w:tcW w:w="3100" w:type="dxa"/>
+            <w:tcBorders>
+              <w:top w:val="single" w:sz="1" w:space="0" w:color="B5C8CD"/>
+              <w:left w:val="single" w:sz="1" w:space="0" w:color="B5C8CD"/>
+              <w:bottom w:val="single" w:sz="1" w:space="0" w:color="B5C8CD"/>
+              <w:right w:val="single" w:sz="1" w:space="0" w:color="B5C8CD"/>
+            </w:tcBorders>
+            <w:tcMar>
+              <w:top w:w="100" w:type="dxa"/>
+              <w:left w:w="140" w:type="dxa"/>
+              <w:bottom w:w="100" w:type="dxa"/>
+              <w:right w:w="140" w:type="dxa"/>
+            </w:tcMar>
+          </w:tcPr>
+          <w:p>
+            <w:r>
+              <w:rPr>
+                <w:sz w:val="20"/>
+                <w:szCs w:val="20"/>
+              </w:rPr>
+              <w:t>Granted by superadmin or admin.</w:t>
+            </w:r>
+          </w:p>
+        </w:tc>
+      </w:tr>
+      <w:tr>
+        <w:tblPrEx>
+          <w:tblCellMar>
+            <w:top w:w="0" w:type="dxa"/>
+            <w:bottom w:w="0" w:type="dxa"/>
+          </w:tblCellMar>
+        </w:tblPrEx>
+        <w:tc>
+          <w:tcPr>
+            <w:tcW w:w="1800" w:type="dxa"/>
+            <w:tcBorders>
+              <w:top w:val="single" w:sz="1" w:space="0" w:color="B5C8CD"/>
+              <w:left w:val="single" w:sz="1" w:space="0" w:color="B5C8CD"/>
+              <w:bottom w:val="single" w:sz="1" w:space="0" w:color="B5C8CD"/>
+              <w:right w:val="single" w:sz="1" w:space="0" w:color="B5C8CD"/>
+            </w:tcBorders>
+            <w:shd w:val="clear" w:color="auto" w:fill="F4F9FC"/>
+            <w:tcMar>
+              <w:top w:w="100" w:type="dxa"/>
+              <w:left w:w="140" w:type="dxa"/>
+              <w:bottom w:w="100" w:type="dxa"/>
+              <w:right w:w="140" w:type="dxa"/>
+            </w:tcMar>
+          </w:tcPr>
+          <w:p>
+            <w:r>
+              <w:rPr>
+                <w:rFonts w:ascii="Consolas" w:eastAsia="Consolas" w:hAnsi="Consolas" w:cs="Consolas"/>
+                <w:color w:val="1C3C6E"/>
+                <w:sz w:val="20"/>
+                <w:szCs w:val="20"/>
+              </w:rPr>
               <w:t>sales_rep</w:t>
             </w:r>
           </w:p>
@@ -1951,6 +2038,7 @@
               <w:bottom w:val="single" w:sz="1" w:space="0" w:color="B5C8CD"/>
               <w:right w:val="single" w:sz="1" w:space="0" w:color="B5C8CD"/>
             </w:tcBorders>
+            <w:shd w:val="clear" w:color="auto" w:fill="F4F9FC"/>
             <w:tcMar>
               <w:top w:w="100" w:type="dxa"/>
               <w:left w:w="140" w:type="dxa"/>
@@ -1977,6 +2065,7 @@
               <w:bottom w:val="single" w:sz="1" w:space="0" w:color="B5C8CD"/>
               <w:right w:val="single" w:sz="1" w:space="0" w:color="B5C8CD"/>
             </w:tcBorders>
+            <w:shd w:val="clear" w:color="auto" w:fill="F4F9FC"/>
             <w:tcMar>
               <w:top w:w="100" w:type="dxa"/>
               <w:left w:w="140" w:type="dxa"/>
@@ -2000,7 +2089,7 @@
       <w:pPr>
         <w:pStyle w:val="Heading1"/>
       </w:pPr>
-      <w:bookmarkStart w:id="3" w:name="_Toc234510990"/>
+      <w:bookmarkStart w:id="3" w:name="_Toc234579187"/>
       <w:r>
         <w:t>3. Permission Matrix</w:t>
       </w:r>
@@ -2011,7 +2100,6 @@
         <w:spacing w:after="160"/>
       </w:pPr>
       <w:r>
-        <w:lastRenderedPageBreak/>
         <w:t>Access is organized by data class. ✓ = full read (writes are separately gated), own = row-scoped to the user’s own records, — = no access.</w:t>
       </w:r>
     </w:p>
@@ -2033,12 +2121,13 @@
         <w:tblLook w:val="04A0" w:firstRow="1" w:lastRow="0" w:firstColumn="1" w:lastColumn="0" w:noHBand="0" w:noVBand="1"/>
       </w:tblPr>
       <w:tblGrid>
-        <w:gridCol w:w="2982"/>
+        <w:gridCol w:w="2363"/>
         <w:gridCol w:w="1414"/>
-        <w:gridCol w:w="1228"/>
-        <w:gridCol w:w="1211"/>
+        <w:gridCol w:w="957"/>
+        <w:gridCol w:w="828"/>
         <w:gridCol w:w="1270"/>
-        <w:gridCol w:w="1255"/>
+        <w:gridCol w:w="1203"/>
+        <w:gridCol w:w="1325"/>
       </w:tblGrid>
       <w:tr>
         <w:tblPrEx>
@@ -2052,7 +2141,7 @@
         </w:trPr>
         <w:tc>
           <w:tcPr>
-            <w:tcW w:w="3060" w:type="dxa"/>
+            <w:tcW w:w="2760" w:type="dxa"/>
             <w:tcBorders>
               <w:top w:val="single" w:sz="1" w:space="0" w:color="B5C8CD"/>
               <w:left w:val="single" w:sz="1" w:space="0" w:color="B5C8CD"/>
@@ -2082,7 +2171,7 @@
         </w:tc>
         <w:tc>
           <w:tcPr>
-            <w:tcW w:w="1260" w:type="dxa"/>
+            <w:tcW w:w="1100" w:type="dxa"/>
             <w:tcBorders>
               <w:top w:val="single" w:sz="1" w:space="0" w:color="B5C8CD"/>
               <w:left w:val="single" w:sz="1" w:space="0" w:color="B5C8CD"/>
@@ -2112,7 +2201,7 @@
         </w:tc>
         <w:tc>
           <w:tcPr>
-            <w:tcW w:w="1260" w:type="dxa"/>
+            <w:tcW w:w="1100" w:type="dxa"/>
             <w:tcBorders>
               <w:top w:val="single" w:sz="1" w:space="0" w:color="B5C8CD"/>
               <w:left w:val="single" w:sz="1" w:space="0" w:color="B5C8CD"/>
@@ -2142,7 +2231,7 @@
         </w:tc>
         <w:tc>
           <w:tcPr>
-            <w:tcW w:w="1260" w:type="dxa"/>
+            <w:tcW w:w="1100" w:type="dxa"/>
             <w:tcBorders>
               <w:top w:val="single" w:sz="1" w:space="0" w:color="B5C8CD"/>
               <w:left w:val="single" w:sz="1" w:space="0" w:color="B5C8CD"/>
@@ -2172,7 +2261,7 @@
         </w:tc>
         <w:tc>
           <w:tcPr>
-            <w:tcW w:w="1260" w:type="dxa"/>
+            <w:tcW w:w="1100" w:type="dxa"/>
             <w:tcBorders>
               <w:top w:val="single" w:sz="1" w:space="0" w:color="B5C8CD"/>
               <w:left w:val="single" w:sz="1" w:space="0" w:color="B5C8CD"/>
@@ -2202,7 +2291,7 @@
         </w:tc>
         <w:tc>
           <w:tcPr>
-            <w:tcW w:w="1260" w:type="dxa"/>
+            <w:tcW w:w="1100" w:type="dxa"/>
             <w:tcBorders>
               <w:top w:val="single" w:sz="1" w:space="0" w:color="B5C8CD"/>
               <w:left w:val="single" w:sz="1" w:space="0" w:color="B5C8CD"/>
@@ -2227,6 +2316,36 @@
                 <w:szCs w:val="20"/>
               </w:rPr>
               <w:t>sales_rep</w:t>
+            </w:r>
+          </w:p>
+        </w:tc>
+        <w:tc>
+          <w:tcPr>
+            <w:tcW w:w="1100" w:type="dxa"/>
+            <w:tcBorders>
+              <w:top w:val="single" w:sz="1" w:space="0" w:color="B5C8CD"/>
+              <w:left w:val="single" w:sz="1" w:space="0" w:color="B5C8CD"/>
+              <w:bottom w:val="single" w:sz="1" w:space="0" w:color="B5C8CD"/>
+              <w:right w:val="single" w:sz="1" w:space="0" w:color="B5C8CD"/>
+            </w:tcBorders>
+            <w:shd w:val="clear" w:color="auto" w:fill="DCEEF8"/>
+            <w:tcMar>
+              <w:top w:w="100" w:type="dxa"/>
+              <w:left w:w="140" w:type="dxa"/>
+              <w:bottom w:w="100" w:type="dxa"/>
+              <w:right w:w="140" w:type="dxa"/>
+            </w:tcMar>
+          </w:tcPr>
+          <w:p>
+            <w:r>
+              <w:rPr>
+                <w:b/>
+                <w:bCs/>
+                <w:color w:val="1C3C6E"/>
+                <w:sz w:val="20"/>
+                <w:szCs w:val="20"/>
+              </w:rPr>
+              <w:t>warehouse</w:t>
             </w:r>
           </w:p>
         </w:tc>
@@ -2240,7 +2359,7 @@
         </w:tblPrEx>
         <w:tc>
           <w:tcPr>
-            <w:tcW w:w="3060" w:type="dxa"/>
+            <w:tcW w:w="2760" w:type="dxa"/>
             <w:tcBorders>
               <w:top w:val="single" w:sz="1" w:space="0" w:color="B5C8CD"/>
               <w:left w:val="single" w:sz="1" w:space="0" w:color="B5C8CD"/>
@@ -2266,7 +2385,7 @@
         </w:tc>
         <w:tc>
           <w:tcPr>
-            <w:tcW w:w="1260" w:type="dxa"/>
+            <w:tcW w:w="1100" w:type="dxa"/>
             <w:tcBorders>
               <w:top w:val="single" w:sz="1" w:space="0" w:color="B5C8CD"/>
               <w:left w:val="single" w:sz="1" w:space="0" w:color="B5C8CD"/>
@@ -2292,7 +2411,7 @@
         </w:tc>
         <w:tc>
           <w:tcPr>
-            <w:tcW w:w="1260" w:type="dxa"/>
+            <w:tcW w:w="1100" w:type="dxa"/>
             <w:tcBorders>
               <w:top w:val="single" w:sz="1" w:space="0" w:color="B5C8CD"/>
               <w:left w:val="single" w:sz="1" w:space="0" w:color="B5C8CD"/>
@@ -2318,7 +2437,7 @@
         </w:tc>
         <w:tc>
           <w:tcPr>
-            <w:tcW w:w="1260" w:type="dxa"/>
+            <w:tcW w:w="1100" w:type="dxa"/>
             <w:tcBorders>
               <w:top w:val="single" w:sz="1" w:space="0" w:color="B5C8CD"/>
               <w:left w:val="single" w:sz="1" w:space="0" w:color="B5C8CD"/>
@@ -2344,7 +2463,7 @@
         </w:tc>
         <w:tc>
           <w:tcPr>
-            <w:tcW w:w="1260" w:type="dxa"/>
+            <w:tcW w:w="1100" w:type="dxa"/>
             <w:tcBorders>
               <w:top w:val="single" w:sz="1" w:space="0" w:color="B5C8CD"/>
               <w:left w:val="single" w:sz="1" w:space="0" w:color="B5C8CD"/>
@@ -2370,7 +2489,33 @@
         </w:tc>
         <w:tc>
           <w:tcPr>
-            <w:tcW w:w="1260" w:type="dxa"/>
+            <w:tcW w:w="1100" w:type="dxa"/>
+            <w:tcBorders>
+              <w:top w:val="single" w:sz="1" w:space="0" w:color="B5C8CD"/>
+              <w:left w:val="single" w:sz="1" w:space="0" w:color="B5C8CD"/>
+              <w:bottom w:val="single" w:sz="1" w:space="0" w:color="B5C8CD"/>
+              <w:right w:val="single" w:sz="1" w:space="0" w:color="B5C8CD"/>
+            </w:tcBorders>
+            <w:tcMar>
+              <w:top w:w="100" w:type="dxa"/>
+              <w:left w:w="140" w:type="dxa"/>
+              <w:bottom w:w="100" w:type="dxa"/>
+              <w:right w:w="140" w:type="dxa"/>
+            </w:tcMar>
+          </w:tcPr>
+          <w:p>
+            <w:r>
+              <w:rPr>
+                <w:sz w:val="20"/>
+                <w:szCs w:val="20"/>
+              </w:rPr>
+              <w:t>—</w:t>
+            </w:r>
+          </w:p>
+        </w:tc>
+        <w:tc>
+          <w:tcPr>
+            <w:tcW w:w="1100" w:type="dxa"/>
             <w:tcBorders>
               <w:top w:val="single" w:sz="1" w:space="0" w:color="B5C8CD"/>
               <w:left w:val="single" w:sz="1" w:space="0" w:color="B5C8CD"/>
@@ -2404,7 +2549,7 @@
         </w:tblPrEx>
         <w:tc>
           <w:tcPr>
-            <w:tcW w:w="3060" w:type="dxa"/>
+            <w:tcW w:w="2760" w:type="dxa"/>
             <w:tcBorders>
               <w:top w:val="single" w:sz="1" w:space="0" w:color="B5C8CD"/>
               <w:left w:val="single" w:sz="1" w:space="0" w:color="B5C8CD"/>
@@ -2431,7 +2576,7 @@
         </w:tc>
         <w:tc>
           <w:tcPr>
-            <w:tcW w:w="1260" w:type="dxa"/>
+            <w:tcW w:w="1100" w:type="dxa"/>
             <w:tcBorders>
               <w:top w:val="single" w:sz="1" w:space="0" w:color="B5C8CD"/>
               <w:left w:val="single" w:sz="1" w:space="0" w:color="B5C8CD"/>
@@ -2458,7 +2603,7 @@
         </w:tc>
         <w:tc>
           <w:tcPr>
-            <w:tcW w:w="1260" w:type="dxa"/>
+            <w:tcW w:w="1100" w:type="dxa"/>
             <w:tcBorders>
               <w:top w:val="single" w:sz="1" w:space="0" w:color="B5C8CD"/>
               <w:left w:val="single" w:sz="1" w:space="0" w:color="B5C8CD"/>
@@ -2485,7 +2630,7 @@
         </w:tc>
         <w:tc>
           <w:tcPr>
-            <w:tcW w:w="1260" w:type="dxa"/>
+            <w:tcW w:w="1100" w:type="dxa"/>
             <w:tcBorders>
               <w:top w:val="single" w:sz="1" w:space="0" w:color="B5C8CD"/>
               <w:left w:val="single" w:sz="1" w:space="0" w:color="B5C8CD"/>
@@ -2512,7 +2657,7 @@
         </w:tc>
         <w:tc>
           <w:tcPr>
-            <w:tcW w:w="1260" w:type="dxa"/>
+            <w:tcW w:w="1100" w:type="dxa"/>
             <w:tcBorders>
               <w:top w:val="single" w:sz="1" w:space="0" w:color="B5C8CD"/>
               <w:left w:val="single" w:sz="1" w:space="0" w:color="B5C8CD"/>
@@ -2539,7 +2684,34 @@
         </w:tc>
         <w:tc>
           <w:tcPr>
-            <w:tcW w:w="1260" w:type="dxa"/>
+            <w:tcW w:w="1100" w:type="dxa"/>
+            <w:tcBorders>
+              <w:top w:val="single" w:sz="1" w:space="0" w:color="B5C8CD"/>
+              <w:left w:val="single" w:sz="1" w:space="0" w:color="B5C8CD"/>
+              <w:bottom w:val="single" w:sz="1" w:space="0" w:color="B5C8CD"/>
+              <w:right w:val="single" w:sz="1" w:space="0" w:color="B5C8CD"/>
+            </w:tcBorders>
+            <w:shd w:val="clear" w:color="auto" w:fill="F4F9FC"/>
+            <w:tcMar>
+              <w:top w:w="100" w:type="dxa"/>
+              <w:left w:w="140" w:type="dxa"/>
+              <w:bottom w:w="100" w:type="dxa"/>
+              <w:right w:w="140" w:type="dxa"/>
+            </w:tcMar>
+          </w:tcPr>
+          <w:p>
+            <w:r>
+              <w:rPr>
+                <w:sz w:val="20"/>
+                <w:szCs w:val="20"/>
+              </w:rPr>
+              <w:t>—</w:t>
+            </w:r>
+          </w:p>
+        </w:tc>
+        <w:tc>
+          <w:tcPr>
+            <w:tcW w:w="1100" w:type="dxa"/>
             <w:tcBorders>
               <w:top w:val="single" w:sz="1" w:space="0" w:color="B5C8CD"/>
               <w:left w:val="single" w:sz="1" w:space="0" w:color="B5C8CD"/>
@@ -2574,7 +2746,7 @@
         </w:tblPrEx>
         <w:tc>
           <w:tcPr>
-            <w:tcW w:w="3060" w:type="dxa"/>
+            <w:tcW w:w="2760" w:type="dxa"/>
             <w:tcBorders>
               <w:top w:val="single" w:sz="1" w:space="0" w:color="B5C8CD"/>
               <w:left w:val="single" w:sz="1" w:space="0" w:color="B5C8CD"/>
@@ -2600,7 +2772,7 @@
         </w:tc>
         <w:tc>
           <w:tcPr>
-            <w:tcW w:w="1260" w:type="dxa"/>
+            <w:tcW w:w="1100" w:type="dxa"/>
             <w:tcBorders>
               <w:top w:val="single" w:sz="1" w:space="0" w:color="B5C8CD"/>
               <w:left w:val="single" w:sz="1" w:space="0" w:color="B5C8CD"/>
@@ -2626,7 +2798,7 @@
         </w:tc>
         <w:tc>
           <w:tcPr>
-            <w:tcW w:w="1260" w:type="dxa"/>
+            <w:tcW w:w="1100" w:type="dxa"/>
             <w:tcBorders>
               <w:top w:val="single" w:sz="1" w:space="0" w:color="B5C8CD"/>
               <w:left w:val="single" w:sz="1" w:space="0" w:color="B5C8CD"/>
@@ -2652,7 +2824,7 @@
         </w:tc>
         <w:tc>
           <w:tcPr>
-            <w:tcW w:w="1260" w:type="dxa"/>
+            <w:tcW w:w="1100" w:type="dxa"/>
             <w:tcBorders>
               <w:top w:val="single" w:sz="1" w:space="0" w:color="B5C8CD"/>
               <w:left w:val="single" w:sz="1" w:space="0" w:color="B5C8CD"/>
@@ -2678,7 +2850,7 @@
         </w:tc>
         <w:tc>
           <w:tcPr>
-            <w:tcW w:w="1260" w:type="dxa"/>
+            <w:tcW w:w="1100" w:type="dxa"/>
             <w:tcBorders>
               <w:top w:val="single" w:sz="1" w:space="0" w:color="B5C8CD"/>
               <w:left w:val="single" w:sz="1" w:space="0" w:color="B5C8CD"/>
@@ -2704,7 +2876,7 @@
         </w:tc>
         <w:tc>
           <w:tcPr>
-            <w:tcW w:w="1260" w:type="dxa"/>
+            <w:tcW w:w="1100" w:type="dxa"/>
             <w:tcBorders>
               <w:top w:val="single" w:sz="1" w:space="0" w:color="B5C8CD"/>
               <w:left w:val="single" w:sz="1" w:space="0" w:color="B5C8CD"/>
@@ -2725,6 +2897,32 @@
                 <w:szCs w:val="20"/>
               </w:rPr>
               <w:t>flag²</w:t>
+            </w:r>
+          </w:p>
+        </w:tc>
+        <w:tc>
+          <w:tcPr>
+            <w:tcW w:w="1100" w:type="dxa"/>
+            <w:tcBorders>
+              <w:top w:val="single" w:sz="1" w:space="0" w:color="B5C8CD"/>
+              <w:left w:val="single" w:sz="1" w:space="0" w:color="B5C8CD"/>
+              <w:bottom w:val="single" w:sz="1" w:space="0" w:color="B5C8CD"/>
+              <w:right w:val="single" w:sz="1" w:space="0" w:color="B5C8CD"/>
+            </w:tcBorders>
+            <w:tcMar>
+              <w:top w:w="100" w:type="dxa"/>
+              <w:left w:w="140" w:type="dxa"/>
+              <w:bottom w:w="100" w:type="dxa"/>
+              <w:right w:w="140" w:type="dxa"/>
+            </w:tcMar>
+          </w:tcPr>
+          <w:p>
+            <w:r>
+              <w:rPr>
+                <w:sz w:val="20"/>
+                <w:szCs w:val="20"/>
+              </w:rPr>
+              <w:t>—</w:t>
             </w:r>
           </w:p>
         </w:tc>
@@ -2738,7 +2936,7 @@
         </w:tblPrEx>
         <w:tc>
           <w:tcPr>
-            <w:tcW w:w="3060" w:type="dxa"/>
+            <w:tcW w:w="2760" w:type="dxa"/>
             <w:tcBorders>
               <w:top w:val="single" w:sz="1" w:space="0" w:color="B5C8CD"/>
               <w:left w:val="single" w:sz="1" w:space="0" w:color="B5C8CD"/>
@@ -2765,7 +2963,7 @@
         </w:tc>
         <w:tc>
           <w:tcPr>
-            <w:tcW w:w="1260" w:type="dxa"/>
+            <w:tcW w:w="1100" w:type="dxa"/>
             <w:tcBorders>
               <w:top w:val="single" w:sz="1" w:space="0" w:color="B5C8CD"/>
               <w:left w:val="single" w:sz="1" w:space="0" w:color="B5C8CD"/>
@@ -2792,7 +2990,7 @@
         </w:tc>
         <w:tc>
           <w:tcPr>
-            <w:tcW w:w="1260" w:type="dxa"/>
+            <w:tcW w:w="1100" w:type="dxa"/>
             <w:tcBorders>
               <w:top w:val="single" w:sz="1" w:space="0" w:color="B5C8CD"/>
               <w:left w:val="single" w:sz="1" w:space="0" w:color="B5C8CD"/>
@@ -2819,7 +3017,7 @@
         </w:tc>
         <w:tc>
           <w:tcPr>
-            <w:tcW w:w="1260" w:type="dxa"/>
+            <w:tcW w:w="1100" w:type="dxa"/>
             <w:tcBorders>
               <w:top w:val="single" w:sz="1" w:space="0" w:color="B5C8CD"/>
               <w:left w:val="single" w:sz="1" w:space="0" w:color="B5C8CD"/>
@@ -2846,7 +3044,7 @@
         </w:tc>
         <w:tc>
           <w:tcPr>
-            <w:tcW w:w="1260" w:type="dxa"/>
+            <w:tcW w:w="1100" w:type="dxa"/>
             <w:tcBorders>
               <w:top w:val="single" w:sz="1" w:space="0" w:color="B5C8CD"/>
               <w:left w:val="single" w:sz="1" w:space="0" w:color="B5C8CD"/>
@@ -2873,7 +3071,34 @@
         </w:tc>
         <w:tc>
           <w:tcPr>
-            <w:tcW w:w="1260" w:type="dxa"/>
+            <w:tcW w:w="1100" w:type="dxa"/>
+            <w:tcBorders>
+              <w:top w:val="single" w:sz="1" w:space="0" w:color="B5C8CD"/>
+              <w:left w:val="single" w:sz="1" w:space="0" w:color="B5C8CD"/>
+              <w:bottom w:val="single" w:sz="1" w:space="0" w:color="B5C8CD"/>
+              <w:right w:val="single" w:sz="1" w:space="0" w:color="B5C8CD"/>
+            </w:tcBorders>
+            <w:shd w:val="clear" w:color="auto" w:fill="F4F9FC"/>
+            <w:tcMar>
+              <w:top w:w="100" w:type="dxa"/>
+              <w:left w:w="140" w:type="dxa"/>
+              <w:bottom w:w="100" w:type="dxa"/>
+              <w:right w:w="140" w:type="dxa"/>
+            </w:tcMar>
+          </w:tcPr>
+          <w:p>
+            <w:r>
+              <w:rPr>
+                <w:sz w:val="20"/>
+                <w:szCs w:val="20"/>
+              </w:rPr>
+              <w:t>✓</w:t>
+            </w:r>
+          </w:p>
+        </w:tc>
+        <w:tc>
+          <w:tcPr>
+            <w:tcW w:w="1100" w:type="dxa"/>
             <w:tcBorders>
               <w:top w:val="single" w:sz="1" w:space="0" w:color="B5C8CD"/>
               <w:left w:val="single" w:sz="1" w:space="0" w:color="B5C8CD"/>
@@ -2908,7 +3133,7 @@
         </w:tblPrEx>
         <w:tc>
           <w:tcPr>
-            <w:tcW w:w="3060" w:type="dxa"/>
+            <w:tcW w:w="2760" w:type="dxa"/>
             <w:tcBorders>
               <w:top w:val="single" w:sz="1" w:space="0" w:color="B5C8CD"/>
               <w:left w:val="single" w:sz="1" w:space="0" w:color="B5C8CD"/>
@@ -2934,7 +3159,7 @@
         </w:tc>
         <w:tc>
           <w:tcPr>
-            <w:tcW w:w="1260" w:type="dxa"/>
+            <w:tcW w:w="1100" w:type="dxa"/>
             <w:tcBorders>
               <w:top w:val="single" w:sz="1" w:space="0" w:color="B5C8CD"/>
               <w:left w:val="single" w:sz="1" w:space="0" w:color="B5C8CD"/>
@@ -2960,7 +3185,7 @@
         </w:tc>
         <w:tc>
           <w:tcPr>
-            <w:tcW w:w="1260" w:type="dxa"/>
+            <w:tcW w:w="1100" w:type="dxa"/>
             <w:tcBorders>
               <w:top w:val="single" w:sz="1" w:space="0" w:color="B5C8CD"/>
               <w:left w:val="single" w:sz="1" w:space="0" w:color="B5C8CD"/>
@@ -2986,7 +3211,7 @@
         </w:tc>
         <w:tc>
           <w:tcPr>
-            <w:tcW w:w="1260" w:type="dxa"/>
+            <w:tcW w:w="1100" w:type="dxa"/>
             <w:tcBorders>
               <w:top w:val="single" w:sz="1" w:space="0" w:color="B5C8CD"/>
               <w:left w:val="single" w:sz="1" w:space="0" w:color="B5C8CD"/>
@@ -3012,7 +3237,7 @@
         </w:tc>
         <w:tc>
           <w:tcPr>
-            <w:tcW w:w="1260" w:type="dxa"/>
+            <w:tcW w:w="1100" w:type="dxa"/>
             <w:tcBorders>
               <w:top w:val="single" w:sz="1" w:space="0" w:color="B5C8CD"/>
               <w:left w:val="single" w:sz="1" w:space="0" w:color="B5C8CD"/>
@@ -3038,7 +3263,33 @@
         </w:tc>
         <w:tc>
           <w:tcPr>
-            <w:tcW w:w="1260" w:type="dxa"/>
+            <w:tcW w:w="1100" w:type="dxa"/>
+            <w:tcBorders>
+              <w:top w:val="single" w:sz="1" w:space="0" w:color="B5C8CD"/>
+              <w:left w:val="single" w:sz="1" w:space="0" w:color="B5C8CD"/>
+              <w:bottom w:val="single" w:sz="1" w:space="0" w:color="B5C8CD"/>
+              <w:right w:val="single" w:sz="1" w:space="0" w:color="B5C8CD"/>
+            </w:tcBorders>
+            <w:tcMar>
+              <w:top w:w="100" w:type="dxa"/>
+              <w:left w:w="140" w:type="dxa"/>
+              <w:bottom w:w="100" w:type="dxa"/>
+              <w:right w:w="140" w:type="dxa"/>
+            </w:tcMar>
+          </w:tcPr>
+          <w:p>
+            <w:r>
+              <w:rPr>
+                <w:sz w:val="20"/>
+                <w:szCs w:val="20"/>
+              </w:rPr>
+              <w:t>—</w:t>
+            </w:r>
+          </w:p>
+        </w:tc>
+        <w:tc>
+          <w:tcPr>
+            <w:tcW w:w="1100" w:type="dxa"/>
             <w:tcBorders>
               <w:top w:val="single" w:sz="1" w:space="0" w:color="B5C8CD"/>
               <w:left w:val="single" w:sz="1" w:space="0" w:color="B5C8CD"/>
@@ -3072,7 +3323,7 @@
         </w:tblPrEx>
         <w:tc>
           <w:tcPr>
-            <w:tcW w:w="3060" w:type="dxa"/>
+            <w:tcW w:w="2760" w:type="dxa"/>
             <w:tcBorders>
               <w:top w:val="single" w:sz="1" w:space="0" w:color="B5C8CD"/>
               <w:left w:val="single" w:sz="1" w:space="0" w:color="B5C8CD"/>
@@ -3099,7 +3350,7 @@
         </w:tc>
         <w:tc>
           <w:tcPr>
-            <w:tcW w:w="1260" w:type="dxa"/>
+            <w:tcW w:w="1100" w:type="dxa"/>
             <w:tcBorders>
               <w:top w:val="single" w:sz="1" w:space="0" w:color="B5C8CD"/>
               <w:left w:val="single" w:sz="1" w:space="0" w:color="B5C8CD"/>
@@ -3126,7 +3377,7 @@
         </w:tc>
         <w:tc>
           <w:tcPr>
-            <w:tcW w:w="1260" w:type="dxa"/>
+            <w:tcW w:w="1100" w:type="dxa"/>
             <w:tcBorders>
               <w:top w:val="single" w:sz="1" w:space="0" w:color="B5C8CD"/>
               <w:left w:val="single" w:sz="1" w:space="0" w:color="B5C8CD"/>
@@ -3153,7 +3404,7 @@
         </w:tc>
         <w:tc>
           <w:tcPr>
-            <w:tcW w:w="1260" w:type="dxa"/>
+            <w:tcW w:w="1100" w:type="dxa"/>
             <w:tcBorders>
               <w:top w:val="single" w:sz="1" w:space="0" w:color="B5C8CD"/>
               <w:left w:val="single" w:sz="1" w:space="0" w:color="B5C8CD"/>
@@ -3180,7 +3431,7 @@
         </w:tc>
         <w:tc>
           <w:tcPr>
-            <w:tcW w:w="1260" w:type="dxa"/>
+            <w:tcW w:w="1100" w:type="dxa"/>
             <w:tcBorders>
               <w:top w:val="single" w:sz="1" w:space="0" w:color="B5C8CD"/>
               <w:left w:val="single" w:sz="1" w:space="0" w:color="B5C8CD"/>
@@ -3207,7 +3458,7 @@
         </w:tc>
         <w:tc>
           <w:tcPr>
-            <w:tcW w:w="1260" w:type="dxa"/>
+            <w:tcW w:w="1100" w:type="dxa"/>
             <w:tcBorders>
               <w:top w:val="single" w:sz="1" w:space="0" w:color="B5C8CD"/>
               <w:left w:val="single" w:sz="1" w:space="0" w:color="B5C8CD"/>
@@ -3229,6 +3480,33 @@
                 <w:szCs w:val="20"/>
               </w:rPr>
               <w:t>own</w:t>
+            </w:r>
+          </w:p>
+        </w:tc>
+        <w:tc>
+          <w:tcPr>
+            <w:tcW w:w="1100" w:type="dxa"/>
+            <w:tcBorders>
+              <w:top w:val="single" w:sz="1" w:space="0" w:color="B5C8CD"/>
+              <w:left w:val="single" w:sz="1" w:space="0" w:color="B5C8CD"/>
+              <w:bottom w:val="single" w:sz="1" w:space="0" w:color="B5C8CD"/>
+              <w:right w:val="single" w:sz="1" w:space="0" w:color="B5C8CD"/>
+            </w:tcBorders>
+            <w:shd w:val="clear" w:color="auto" w:fill="F4F9FC"/>
+            <w:tcMar>
+              <w:top w:w="100" w:type="dxa"/>
+              <w:left w:w="140" w:type="dxa"/>
+              <w:bottom w:w="100" w:type="dxa"/>
+              <w:right w:w="140" w:type="dxa"/>
+            </w:tcMar>
+          </w:tcPr>
+          <w:p>
+            <w:r>
+              <w:rPr>
+                <w:sz w:val="20"/>
+                <w:szCs w:val="20"/>
+              </w:rPr>
+              <w:t>—</w:t>
             </w:r>
           </w:p>
         </w:tc>
@@ -3242,7 +3520,7 @@
         </w:tblPrEx>
         <w:tc>
           <w:tcPr>
-            <w:tcW w:w="3060" w:type="dxa"/>
+            <w:tcW w:w="2760" w:type="dxa"/>
             <w:tcBorders>
               <w:top w:val="single" w:sz="1" w:space="0" w:color="B5C8CD"/>
               <w:left w:val="single" w:sz="1" w:space="0" w:color="B5C8CD"/>
@@ -3268,7 +3546,7 @@
         </w:tc>
         <w:tc>
           <w:tcPr>
-            <w:tcW w:w="1260" w:type="dxa"/>
+            <w:tcW w:w="1100" w:type="dxa"/>
             <w:tcBorders>
               <w:top w:val="single" w:sz="1" w:space="0" w:color="B5C8CD"/>
               <w:left w:val="single" w:sz="1" w:space="0" w:color="B5C8CD"/>
@@ -3294,7 +3572,7 @@
         </w:tc>
         <w:tc>
           <w:tcPr>
-            <w:tcW w:w="1260" w:type="dxa"/>
+            <w:tcW w:w="1100" w:type="dxa"/>
             <w:tcBorders>
               <w:top w:val="single" w:sz="1" w:space="0" w:color="B5C8CD"/>
               <w:left w:val="single" w:sz="1" w:space="0" w:color="B5C8CD"/>
@@ -3320,7 +3598,7 @@
         </w:tc>
         <w:tc>
           <w:tcPr>
-            <w:tcW w:w="1260" w:type="dxa"/>
+            <w:tcW w:w="1100" w:type="dxa"/>
             <w:tcBorders>
               <w:top w:val="single" w:sz="1" w:space="0" w:color="B5C8CD"/>
               <w:left w:val="single" w:sz="1" w:space="0" w:color="B5C8CD"/>
@@ -3346,7 +3624,7 @@
         </w:tc>
         <w:tc>
           <w:tcPr>
-            <w:tcW w:w="1260" w:type="dxa"/>
+            <w:tcW w:w="1100" w:type="dxa"/>
             <w:tcBorders>
               <w:top w:val="single" w:sz="1" w:space="0" w:color="B5C8CD"/>
               <w:left w:val="single" w:sz="1" w:space="0" w:color="B5C8CD"/>
@@ -3372,7 +3650,7 @@
         </w:tc>
         <w:tc>
           <w:tcPr>
-            <w:tcW w:w="1260" w:type="dxa"/>
+            <w:tcW w:w="1100" w:type="dxa"/>
             <w:tcBorders>
               <w:top w:val="single" w:sz="1" w:space="0" w:color="B5C8CD"/>
               <w:left w:val="single" w:sz="1" w:space="0" w:color="B5C8CD"/>
@@ -3393,6 +3671,32 @@
                 <w:szCs w:val="20"/>
               </w:rPr>
               <w:t>✓</w:t>
+            </w:r>
+          </w:p>
+        </w:tc>
+        <w:tc>
+          <w:tcPr>
+            <w:tcW w:w="1100" w:type="dxa"/>
+            <w:tcBorders>
+              <w:top w:val="single" w:sz="1" w:space="0" w:color="B5C8CD"/>
+              <w:left w:val="single" w:sz="1" w:space="0" w:color="B5C8CD"/>
+              <w:bottom w:val="single" w:sz="1" w:space="0" w:color="B5C8CD"/>
+              <w:right w:val="single" w:sz="1" w:space="0" w:color="B5C8CD"/>
+            </w:tcBorders>
+            <w:tcMar>
+              <w:top w:w="100" w:type="dxa"/>
+              <w:left w:w="140" w:type="dxa"/>
+              <w:bottom w:w="100" w:type="dxa"/>
+              <w:right w:w="140" w:type="dxa"/>
+            </w:tcMar>
+          </w:tcPr>
+          <w:p>
+            <w:r>
+              <w:rPr>
+                <w:sz w:val="20"/>
+                <w:szCs w:val="20"/>
+              </w:rPr>
+              <w:t>—</w:t>
             </w:r>
           </w:p>
         </w:tc>
@@ -3406,7 +3710,7 @@
         </w:tblPrEx>
         <w:tc>
           <w:tcPr>
-            <w:tcW w:w="3060" w:type="dxa"/>
+            <w:tcW w:w="2760" w:type="dxa"/>
             <w:tcBorders>
               <w:top w:val="single" w:sz="1" w:space="0" w:color="B5C8CD"/>
               <w:left w:val="single" w:sz="1" w:space="0" w:color="B5C8CD"/>
@@ -3433,7 +3737,7 @@
         </w:tc>
         <w:tc>
           <w:tcPr>
-            <w:tcW w:w="1260" w:type="dxa"/>
+            <w:tcW w:w="1100" w:type="dxa"/>
             <w:tcBorders>
               <w:top w:val="single" w:sz="1" w:space="0" w:color="B5C8CD"/>
               <w:left w:val="single" w:sz="1" w:space="0" w:color="B5C8CD"/>
@@ -3460,7 +3764,7 @@
         </w:tc>
         <w:tc>
           <w:tcPr>
-            <w:tcW w:w="1260" w:type="dxa"/>
+            <w:tcW w:w="1100" w:type="dxa"/>
             <w:tcBorders>
               <w:top w:val="single" w:sz="1" w:space="0" w:color="B5C8CD"/>
               <w:left w:val="single" w:sz="1" w:space="0" w:color="B5C8CD"/>
@@ -3487,7 +3791,7 @@
         </w:tc>
         <w:tc>
           <w:tcPr>
-            <w:tcW w:w="1260" w:type="dxa"/>
+            <w:tcW w:w="1100" w:type="dxa"/>
             <w:tcBorders>
               <w:top w:val="single" w:sz="1" w:space="0" w:color="B5C8CD"/>
               <w:left w:val="single" w:sz="1" w:space="0" w:color="B5C8CD"/>
@@ -3514,7 +3818,7 @@
         </w:tc>
         <w:tc>
           <w:tcPr>
-            <w:tcW w:w="1260" w:type="dxa"/>
+            <w:tcW w:w="1100" w:type="dxa"/>
             <w:tcBorders>
               <w:top w:val="single" w:sz="1" w:space="0" w:color="B5C8CD"/>
               <w:left w:val="single" w:sz="1" w:space="0" w:color="B5C8CD"/>
@@ -3541,7 +3845,7 @@
         </w:tc>
         <w:tc>
           <w:tcPr>
-            <w:tcW w:w="1260" w:type="dxa"/>
+            <w:tcW w:w="1100" w:type="dxa"/>
             <w:tcBorders>
               <w:top w:val="single" w:sz="1" w:space="0" w:color="B5C8CD"/>
               <w:left w:val="single" w:sz="1" w:space="0" w:color="B5C8CD"/>
@@ -3563,6 +3867,33 @@
                 <w:szCs w:val="20"/>
               </w:rPr>
               <w:t>own</w:t>
+            </w:r>
+          </w:p>
+        </w:tc>
+        <w:tc>
+          <w:tcPr>
+            <w:tcW w:w="1100" w:type="dxa"/>
+            <w:tcBorders>
+              <w:top w:val="single" w:sz="1" w:space="0" w:color="B5C8CD"/>
+              <w:left w:val="single" w:sz="1" w:space="0" w:color="B5C8CD"/>
+              <w:bottom w:val="single" w:sz="1" w:space="0" w:color="B5C8CD"/>
+              <w:right w:val="single" w:sz="1" w:space="0" w:color="B5C8CD"/>
+            </w:tcBorders>
+            <w:shd w:val="clear" w:color="auto" w:fill="F4F9FC"/>
+            <w:tcMar>
+              <w:top w:w="100" w:type="dxa"/>
+              <w:left w:w="140" w:type="dxa"/>
+              <w:bottom w:w="100" w:type="dxa"/>
+              <w:right w:w="140" w:type="dxa"/>
+            </w:tcMar>
+          </w:tcPr>
+          <w:p>
+            <w:r>
+              <w:rPr>
+                <w:sz w:val="20"/>
+                <w:szCs w:val="20"/>
+              </w:rPr>
+              <w:t>—</w:t>
             </w:r>
           </w:p>
         </w:tc>
@@ -3576,7 +3907,7 @@
         </w:tblPrEx>
         <w:tc>
           <w:tcPr>
-            <w:tcW w:w="3060" w:type="dxa"/>
+            <w:tcW w:w="2760" w:type="dxa"/>
             <w:tcBorders>
               <w:top w:val="single" w:sz="1" w:space="0" w:color="B5C8CD"/>
               <w:left w:val="single" w:sz="1" w:space="0" w:color="B5C8CD"/>
@@ -3602,7 +3933,7 @@
         </w:tc>
         <w:tc>
           <w:tcPr>
-            <w:tcW w:w="1260" w:type="dxa"/>
+            <w:tcW w:w="1100" w:type="dxa"/>
             <w:tcBorders>
               <w:top w:val="single" w:sz="1" w:space="0" w:color="B5C8CD"/>
               <w:left w:val="single" w:sz="1" w:space="0" w:color="B5C8CD"/>
@@ -3628,7 +3959,7 @@
         </w:tc>
         <w:tc>
           <w:tcPr>
-            <w:tcW w:w="1260" w:type="dxa"/>
+            <w:tcW w:w="1100" w:type="dxa"/>
             <w:tcBorders>
               <w:top w:val="single" w:sz="1" w:space="0" w:color="B5C8CD"/>
               <w:left w:val="single" w:sz="1" w:space="0" w:color="B5C8CD"/>
@@ -3654,7 +3985,7 @@
         </w:tc>
         <w:tc>
           <w:tcPr>
-            <w:tcW w:w="1260" w:type="dxa"/>
+            <w:tcW w:w="1100" w:type="dxa"/>
             <w:tcBorders>
               <w:top w:val="single" w:sz="1" w:space="0" w:color="B5C8CD"/>
               <w:left w:val="single" w:sz="1" w:space="0" w:color="B5C8CD"/>
@@ -3680,7 +4011,7 @@
         </w:tc>
         <w:tc>
           <w:tcPr>
-            <w:tcW w:w="1260" w:type="dxa"/>
+            <w:tcW w:w="1100" w:type="dxa"/>
             <w:tcBorders>
               <w:top w:val="single" w:sz="1" w:space="0" w:color="B5C8CD"/>
               <w:left w:val="single" w:sz="1" w:space="0" w:color="B5C8CD"/>
@@ -3706,13 +4037,236 @@
         </w:tc>
         <w:tc>
           <w:tcPr>
-            <w:tcW w:w="1260" w:type="dxa"/>
-            <w:tcBorders>
-              <w:top w:val="single" w:sz="1" w:space="0" w:color="B5C8CD"/>
-              <w:left w:val="single" w:sz="1" w:space="0" w:color="B5C8CD"/>
-              <w:bottom w:val="single" w:sz="1" w:space="0" w:color="B5C8CD"/>
-              <w:right w:val="single" w:sz="1" w:space="0" w:color="B5C8CD"/>
-            </w:tcBorders>
+            <w:tcW w:w="1100" w:type="dxa"/>
+            <w:tcBorders>
+              <w:top w:val="single" w:sz="1" w:space="0" w:color="B5C8CD"/>
+              <w:left w:val="single" w:sz="1" w:space="0" w:color="B5C8CD"/>
+              <w:bottom w:val="single" w:sz="1" w:space="0" w:color="B5C8CD"/>
+              <w:right w:val="single" w:sz="1" w:space="0" w:color="B5C8CD"/>
+            </w:tcBorders>
+            <w:tcMar>
+              <w:top w:w="100" w:type="dxa"/>
+              <w:left w:w="140" w:type="dxa"/>
+              <w:bottom w:w="100" w:type="dxa"/>
+              <w:right w:w="140" w:type="dxa"/>
+            </w:tcMar>
+          </w:tcPr>
+          <w:p>
+            <w:r>
+              <w:rPr>
+                <w:sz w:val="20"/>
+                <w:szCs w:val="20"/>
+              </w:rPr>
+              <w:t>✓</w:t>
+            </w:r>
+          </w:p>
+        </w:tc>
+        <w:tc>
+          <w:tcPr>
+            <w:tcW w:w="1100" w:type="dxa"/>
+            <w:tcBorders>
+              <w:top w:val="single" w:sz="1" w:space="0" w:color="B5C8CD"/>
+              <w:left w:val="single" w:sz="1" w:space="0" w:color="B5C8CD"/>
+              <w:bottom w:val="single" w:sz="1" w:space="0" w:color="B5C8CD"/>
+              <w:right w:val="single" w:sz="1" w:space="0" w:color="B5C8CD"/>
+            </w:tcBorders>
+            <w:tcMar>
+              <w:top w:w="100" w:type="dxa"/>
+              <w:left w:w="140" w:type="dxa"/>
+              <w:bottom w:w="100" w:type="dxa"/>
+              <w:right w:w="140" w:type="dxa"/>
+            </w:tcMar>
+          </w:tcPr>
+          <w:p>
+            <w:r>
+              <w:rPr>
+                <w:sz w:val="20"/>
+                <w:szCs w:val="20"/>
+              </w:rPr>
+              <w:t>✓</w:t>
+            </w:r>
+          </w:p>
+        </w:tc>
+      </w:tr>
+      <w:tr>
+        <w:tblPrEx>
+          <w:tblCellMar>
+            <w:top w:w="0" w:type="dxa"/>
+            <w:bottom w:w="0" w:type="dxa"/>
+          </w:tblCellMar>
+        </w:tblPrEx>
+        <w:tc>
+          <w:tcPr>
+            <w:tcW w:w="2760" w:type="dxa"/>
+            <w:tcBorders>
+              <w:top w:val="single" w:sz="1" w:space="0" w:color="B5C8CD"/>
+              <w:left w:val="single" w:sz="1" w:space="0" w:color="B5C8CD"/>
+              <w:bottom w:val="single" w:sz="1" w:space="0" w:color="B5C8CD"/>
+              <w:right w:val="single" w:sz="1" w:space="0" w:color="B5C8CD"/>
+            </w:tcBorders>
+            <w:shd w:val="clear" w:color="auto" w:fill="F4F9FC"/>
+            <w:tcMar>
+              <w:top w:w="100" w:type="dxa"/>
+              <w:left w:w="140" w:type="dxa"/>
+              <w:bottom w:w="100" w:type="dxa"/>
+              <w:right w:w="140" w:type="dxa"/>
+            </w:tcMar>
+          </w:tcPr>
+          <w:p>
+            <w:r>
+              <w:rPr>
+                <w:sz w:val="20"/>
+                <w:szCs w:val="20"/>
+              </w:rPr>
+              <w:t>Warehouse wallboard (role entry; TVs use the shared password)</w:t>
+            </w:r>
+          </w:p>
+        </w:tc>
+        <w:tc>
+          <w:tcPr>
+            <w:tcW w:w="1100" w:type="dxa"/>
+            <w:tcBorders>
+              <w:top w:val="single" w:sz="1" w:space="0" w:color="B5C8CD"/>
+              <w:left w:val="single" w:sz="1" w:space="0" w:color="B5C8CD"/>
+              <w:bottom w:val="single" w:sz="1" w:space="0" w:color="B5C8CD"/>
+              <w:right w:val="single" w:sz="1" w:space="0" w:color="B5C8CD"/>
+            </w:tcBorders>
+            <w:shd w:val="clear" w:color="auto" w:fill="F4F9FC"/>
+            <w:tcMar>
+              <w:top w:w="100" w:type="dxa"/>
+              <w:left w:w="140" w:type="dxa"/>
+              <w:bottom w:w="100" w:type="dxa"/>
+              <w:right w:w="140" w:type="dxa"/>
+            </w:tcMar>
+          </w:tcPr>
+          <w:p>
+            <w:r>
+              <w:rPr>
+                <w:sz w:val="20"/>
+                <w:szCs w:val="20"/>
+              </w:rPr>
+              <w:t>✓</w:t>
+            </w:r>
+          </w:p>
+        </w:tc>
+        <w:tc>
+          <w:tcPr>
+            <w:tcW w:w="1100" w:type="dxa"/>
+            <w:tcBorders>
+              <w:top w:val="single" w:sz="1" w:space="0" w:color="B5C8CD"/>
+              <w:left w:val="single" w:sz="1" w:space="0" w:color="B5C8CD"/>
+              <w:bottom w:val="single" w:sz="1" w:space="0" w:color="B5C8CD"/>
+              <w:right w:val="single" w:sz="1" w:space="0" w:color="B5C8CD"/>
+            </w:tcBorders>
+            <w:shd w:val="clear" w:color="auto" w:fill="F4F9FC"/>
+            <w:tcMar>
+              <w:top w:w="100" w:type="dxa"/>
+              <w:left w:w="140" w:type="dxa"/>
+              <w:bottom w:w="100" w:type="dxa"/>
+              <w:right w:w="140" w:type="dxa"/>
+            </w:tcMar>
+          </w:tcPr>
+          <w:p>
+            <w:r>
+              <w:rPr>
+                <w:sz w:val="20"/>
+                <w:szCs w:val="20"/>
+              </w:rPr>
+              <w:t>✓</w:t>
+            </w:r>
+          </w:p>
+        </w:tc>
+        <w:tc>
+          <w:tcPr>
+            <w:tcW w:w="1100" w:type="dxa"/>
+            <w:tcBorders>
+              <w:top w:val="single" w:sz="1" w:space="0" w:color="B5C8CD"/>
+              <w:left w:val="single" w:sz="1" w:space="0" w:color="B5C8CD"/>
+              <w:bottom w:val="single" w:sz="1" w:space="0" w:color="B5C8CD"/>
+              <w:right w:val="single" w:sz="1" w:space="0" w:color="B5C8CD"/>
+            </w:tcBorders>
+            <w:shd w:val="clear" w:color="auto" w:fill="F4F9FC"/>
+            <w:tcMar>
+              <w:top w:w="100" w:type="dxa"/>
+              <w:left w:w="140" w:type="dxa"/>
+              <w:bottom w:w="100" w:type="dxa"/>
+              <w:right w:w="140" w:type="dxa"/>
+            </w:tcMar>
+          </w:tcPr>
+          <w:p>
+            <w:r>
+              <w:rPr>
+                <w:sz w:val="20"/>
+                <w:szCs w:val="20"/>
+              </w:rPr>
+              <w:t>✓</w:t>
+            </w:r>
+          </w:p>
+        </w:tc>
+        <w:tc>
+          <w:tcPr>
+            <w:tcW w:w="1100" w:type="dxa"/>
+            <w:tcBorders>
+              <w:top w:val="single" w:sz="1" w:space="0" w:color="B5C8CD"/>
+              <w:left w:val="single" w:sz="1" w:space="0" w:color="B5C8CD"/>
+              <w:bottom w:val="single" w:sz="1" w:space="0" w:color="B5C8CD"/>
+              <w:right w:val="single" w:sz="1" w:space="0" w:color="B5C8CD"/>
+            </w:tcBorders>
+            <w:shd w:val="clear" w:color="auto" w:fill="F4F9FC"/>
+            <w:tcMar>
+              <w:top w:w="100" w:type="dxa"/>
+              <w:left w:w="140" w:type="dxa"/>
+              <w:bottom w:w="100" w:type="dxa"/>
+              <w:right w:w="140" w:type="dxa"/>
+            </w:tcMar>
+          </w:tcPr>
+          <w:p>
+            <w:r>
+              <w:rPr>
+                <w:sz w:val="20"/>
+                <w:szCs w:val="20"/>
+              </w:rPr>
+              <w:t>—</w:t>
+            </w:r>
+          </w:p>
+        </w:tc>
+        <w:tc>
+          <w:tcPr>
+            <w:tcW w:w="1100" w:type="dxa"/>
+            <w:tcBorders>
+              <w:top w:val="single" w:sz="1" w:space="0" w:color="B5C8CD"/>
+              <w:left w:val="single" w:sz="1" w:space="0" w:color="B5C8CD"/>
+              <w:bottom w:val="single" w:sz="1" w:space="0" w:color="B5C8CD"/>
+              <w:right w:val="single" w:sz="1" w:space="0" w:color="B5C8CD"/>
+            </w:tcBorders>
+            <w:shd w:val="clear" w:color="auto" w:fill="F4F9FC"/>
+            <w:tcMar>
+              <w:top w:w="100" w:type="dxa"/>
+              <w:left w:w="140" w:type="dxa"/>
+              <w:bottom w:w="100" w:type="dxa"/>
+              <w:right w:w="140" w:type="dxa"/>
+            </w:tcMar>
+          </w:tcPr>
+          <w:p>
+            <w:r>
+              <w:rPr>
+                <w:sz w:val="20"/>
+                <w:szCs w:val="20"/>
+              </w:rPr>
+              <w:t>—</w:t>
+            </w:r>
+          </w:p>
+        </w:tc>
+        <w:tc>
+          <w:tcPr>
+            <w:tcW w:w="1100" w:type="dxa"/>
+            <w:tcBorders>
+              <w:top w:val="single" w:sz="1" w:space="0" w:color="B5C8CD"/>
+              <w:left w:val="single" w:sz="1" w:space="0" w:color="B5C8CD"/>
+              <w:bottom w:val="single" w:sz="1" w:space="0" w:color="B5C8CD"/>
+              <w:right w:val="single" w:sz="1" w:space="0" w:color="B5C8CD"/>
+            </w:tcBorders>
+            <w:shd w:val="clear" w:color="auto" w:fill="F4F9FC"/>
             <w:tcMar>
               <w:top w:w="100" w:type="dxa"/>
               <w:left w:w="140" w:type="dxa"/>
@@ -3780,7 +4334,7 @@
       <w:pPr>
         <w:pStyle w:val="Heading1"/>
       </w:pPr>
-      <w:bookmarkStart w:id="4" w:name="_Toc234510991"/>
+      <w:bookmarkStart w:id="4" w:name="_Toc234579188"/>
       <w:r>
         <w:t>4. Enforcement Layers (Defense in Depth)</w:t>
       </w:r>
@@ -3798,7 +4352,7 @@
       <w:pPr>
         <w:pStyle w:val="Heading2"/>
       </w:pPr>
-      <w:bookmarkStart w:id="5" w:name="_Toc234510992"/>
+      <w:bookmarkStart w:id="5" w:name="_Toc234579189"/>
       <w:r>
         <w:t>4.1 API route guards</w:t>
       </w:r>
@@ -3893,7 +4447,6 @@
                 <w:sz w:val="20"/>
                 <w:szCs w:val="20"/>
               </w:rPr>
-              <w:lastRenderedPageBreak/>
               <w:t>Option set</w:t>
             </w:r>
           </w:p>
@@ -4302,7 +4855,133 @@
                 <w:sz w:val="20"/>
                 <w:szCs w:val="20"/>
               </w:rPr>
-              <w:t>every signed-in role (estimator tool; its config endpoints stay staff-tier)</w:t>
+              <w:t>every signed-in role including warehouse (estimator tool; its config endpoints stay staff-tier)</w:t>
+            </w:r>
+          </w:p>
+        </w:tc>
+      </w:tr>
+      <w:tr>
+        <w:tblPrEx>
+          <w:tblCellMar>
+            <w:top w:w="0" w:type="dxa"/>
+            <w:bottom w:w="0" w:type="dxa"/>
+          </w:tblCellMar>
+        </w:tblPrEx>
+        <w:tc>
+          <w:tcPr>
+            <w:tcW w:w="3600" w:type="dxa"/>
+            <w:tcBorders>
+              <w:top w:val="single" w:sz="1" w:space="0" w:color="B5C8CD"/>
+              <w:left w:val="single" w:sz="1" w:space="0" w:color="B5C8CD"/>
+              <w:bottom w:val="single" w:sz="1" w:space="0" w:color="B5C8CD"/>
+              <w:right w:val="single" w:sz="1" w:space="0" w:color="B5C8CD"/>
+            </w:tcBorders>
+            <w:tcMar>
+              <w:top w:w="100" w:type="dxa"/>
+              <w:left w:w="140" w:type="dxa"/>
+              <w:bottom w:w="100" w:type="dxa"/>
+              <w:right w:w="140" w:type="dxa"/>
+            </w:tcMar>
+          </w:tcPr>
+          <w:p>
+            <w:r>
+              <w:rPr>
+                <w:rFonts w:ascii="Consolas" w:eastAsia="Consolas" w:hAnsi="Consolas" w:cs="Consolas"/>
+                <w:color w:val="1C3C6E"/>
+                <w:sz w:val="20"/>
+                <w:szCs w:val="20"/>
+              </w:rPr>
+              <w:t>KANBAN_API_AUTH_OPTIONS</w:t>
+            </w:r>
+          </w:p>
+        </w:tc>
+        <w:tc>
+          <w:tcPr>
+            <w:tcW w:w="5760" w:type="dxa"/>
+            <w:tcBorders>
+              <w:top w:val="single" w:sz="1" w:space="0" w:color="B5C8CD"/>
+              <w:left w:val="single" w:sz="1" w:space="0" w:color="B5C8CD"/>
+              <w:bottom w:val="single" w:sz="1" w:space="0" w:color="B5C8CD"/>
+              <w:right w:val="single" w:sz="1" w:space="0" w:color="B5C8CD"/>
+            </w:tcBorders>
+            <w:tcMar>
+              <w:top w:w="100" w:type="dxa"/>
+              <w:left w:w="140" w:type="dxa"/>
+              <w:bottom w:w="100" w:type="dxa"/>
+              <w:right w:w="140" w:type="dxa"/>
+            </w:tcMar>
+          </w:tcPr>
+          <w:p>
+            <w:r>
+              <w:rPr>
+                <w:sz w:val="20"/>
+                <w:szCs w:val="20"/>
+              </w:rPr>
+              <w:t>every signed-in role including warehouse; board/task permissions enforced inside the kanban module</w:t>
+            </w:r>
+          </w:p>
+        </w:tc>
+      </w:tr>
+      <w:tr>
+        <w:tblPrEx>
+          <w:tblCellMar>
+            <w:top w:w="0" w:type="dxa"/>
+            <w:bottom w:w="0" w:type="dxa"/>
+          </w:tblCellMar>
+        </w:tblPrEx>
+        <w:tc>
+          <w:tcPr>
+            <w:tcW w:w="3600" w:type="dxa"/>
+            <w:tcBorders>
+              <w:top w:val="single" w:sz="1" w:space="0" w:color="B5C8CD"/>
+              <w:left w:val="single" w:sz="1" w:space="0" w:color="B5C8CD"/>
+              <w:bottom w:val="single" w:sz="1" w:space="0" w:color="B5C8CD"/>
+              <w:right w:val="single" w:sz="1" w:space="0" w:color="B5C8CD"/>
+            </w:tcBorders>
+            <w:shd w:val="clear" w:color="auto" w:fill="F4F9FC"/>
+            <w:tcMar>
+              <w:top w:w="100" w:type="dxa"/>
+              <w:left w:w="140" w:type="dxa"/>
+              <w:bottom w:w="100" w:type="dxa"/>
+              <w:right w:w="140" w:type="dxa"/>
+            </w:tcMar>
+          </w:tcPr>
+          <w:p>
+            <w:r>
+              <w:rPr>
+                <w:rFonts w:ascii="Consolas" w:eastAsia="Consolas" w:hAnsi="Consolas" w:cs="Consolas"/>
+                <w:color w:val="1C3C6E"/>
+                <w:sz w:val="20"/>
+                <w:szCs w:val="20"/>
+              </w:rPr>
+              <w:t>CATALOG_API_AUTH_OPTIONS</w:t>
+            </w:r>
+          </w:p>
+        </w:tc>
+        <w:tc>
+          <w:tcPr>
+            <w:tcW w:w="5760" w:type="dxa"/>
+            <w:tcBorders>
+              <w:top w:val="single" w:sz="1" w:space="0" w:color="B5C8CD"/>
+              <w:left w:val="single" w:sz="1" w:space="0" w:color="B5C8CD"/>
+              <w:bottom w:val="single" w:sz="1" w:space="0" w:color="B5C8CD"/>
+              <w:right w:val="single" w:sz="1" w:space="0" w:color="B5C8CD"/>
+            </w:tcBorders>
+            <w:shd w:val="clear" w:color="auto" w:fill="F4F9FC"/>
+            <w:tcMar>
+              <w:top w:w="100" w:type="dxa"/>
+              <w:left w:w="140" w:type="dxa"/>
+              <w:bottom w:w="100" w:type="dxa"/>
+              <w:right w:w="140" w:type="dxa"/>
+            </w:tcMar>
+          </w:tcPr>
+          <w:p>
+            <w:r>
+              <w:rPr>
+                <w:sz w:val="20"/>
+                <w:szCs w:val="20"/>
+              </w:rPr>
+              <w:t>every signed-in role including warehouse (supplier catalog + cost per owner decision)</w:t>
             </w:r>
           </w:p>
         </w:tc>
@@ -4320,7 +4999,7 @@
       <w:pPr>
         <w:pStyle w:val="Heading2"/>
       </w:pPr>
-      <w:bookmarkStart w:id="6" w:name="_Toc234510993"/>
+      <w:bookmarkStart w:id="6" w:name="_Toc234579190"/>
       <w:r>
         <w:t>4.2 Page layouts and navigation</w:t>
       </w:r>
@@ -4362,7 +5041,7 @@
       <w:pPr>
         <w:pStyle w:val="Heading2"/>
       </w:pPr>
-      <w:bookmarkStart w:id="7" w:name="_Toc234510994"/>
+      <w:bookmarkStart w:id="7" w:name="_Toc234579191"/>
       <w:r>
         <w:t>4.3 Row-Level Security</w:t>
       </w:r>
@@ -4440,7 +5119,7 @@
       <w:pPr>
         <w:pStyle w:val="Heading2"/>
       </w:pPr>
-      <w:bookmarkStart w:id="8" w:name="_Toc234510995"/>
+      <w:bookmarkStart w:id="8" w:name="_Toc234579192"/>
       <w:r>
         <w:t>4.4 Database triggers (invariants)</w:t>
       </w:r>
@@ -4485,7 +5164,7 @@
       <w:pPr>
         <w:pStyle w:val="Heading1"/>
       </w:pPr>
-      <w:bookmarkStart w:id="9" w:name="_Toc234510996"/>
+      <w:bookmarkStart w:id="9" w:name="_Toc234579193"/>
       <w:r>
         <w:t>5. Authentication Flow</w:t>
       </w:r>
@@ -4495,7 +5174,7 @@
       <w:pPr>
         <w:pStyle w:val="Heading2"/>
       </w:pPr>
-      <w:bookmarkStart w:id="10" w:name="_Toc234510997"/>
+      <w:bookmarkStart w:id="10" w:name="_Toc234579194"/>
       <w:r>
         <w:t>5.1 Sign-in</w:t>
       </w:r>
@@ -4513,7 +5192,7 @@
       <w:pPr>
         <w:pStyle w:val="Heading2"/>
       </w:pPr>
-      <w:bookmarkStart w:id="11" w:name="_Toc234510998"/>
+      <w:bookmarkStart w:id="11" w:name="_Toc234579195"/>
       <w:r>
         <w:t>5.2 Invites and password resets</w:t>
       </w:r>
@@ -4524,7 +5203,6 @@
         <w:spacing w:after="160"/>
       </w:pPr>
       <w:r>
-        <w:lastRenderedPageBreak/>
         <w:t>Both flows use the same mechanism: the server generates a single-use Supabase recovery token (admin generateLink), embeds it in a link to /reset-password, and delivers it through Resend. The page redeems the token (verifyOtp), lets the user set a password with live validation, then signs the recovery session out so the normal login flow — including 2FA — is the only way in. Links expire in about an hour; issuing a new one invalidates the old.</w:t>
       </w:r>
     </w:p>
@@ -4558,7 +5236,7 @@
       <w:pPr>
         <w:pStyle w:val="Heading2"/>
       </w:pPr>
-      <w:bookmarkStart w:id="12" w:name="_Toc234510999"/>
+      <w:bookmarkStart w:id="12" w:name="_Toc234579196"/>
       <w:r>
         <w:t>5.3 Password policy (NIST 800-63B aligned)</w:t>
       </w:r>
@@ -4607,7 +5285,7 @@
       <w:pPr>
         <w:pStyle w:val="Heading1"/>
       </w:pPr>
-      <w:bookmarkStart w:id="13" w:name="_Toc234511000"/>
+      <w:bookmarkStart w:id="13" w:name="_Toc234579197"/>
       <w:r>
         <w:t>6. Lifecycle Operations and Audit Trail</w:t>
       </w:r>
@@ -5386,9 +6064,8 @@
       <w:pPr>
         <w:pStyle w:val="Heading1"/>
       </w:pPr>
-      <w:bookmarkStart w:id="14" w:name="_Toc234511001"/>
-      <w:r>
-        <w:lastRenderedPageBreak/>
+      <w:bookmarkStart w:id="14" w:name="_Toc234579198"/>
+      <w:r>
         <w:t>7. Configuration Reference (Railway)</w:t>
       </w:r>
       <w:bookmarkEnd w:id="14"/>
@@ -6166,7 +6843,7 @@
       <w:pPr>
         <w:pStyle w:val="Heading1"/>
       </w:pPr>
-      <w:bookmarkStart w:id="15" w:name="_Toc234511002"/>
+      <w:bookmarkStart w:id="15" w:name="_Toc234579199"/>
       <w:r>
         <w:t>8. Key Files and Tables</w:t>
       </w:r>
@@ -6961,9 +7638,8 @@
       <w:pPr>
         <w:pStyle w:val="Heading1"/>
       </w:pPr>
-      <w:bookmarkStart w:id="16" w:name="_Toc234511003"/>
-      <w:r>
-        <w:lastRenderedPageBreak/>
+      <w:bookmarkStart w:id="16" w:name="_Toc234579200"/>
+      <w:r>
         <w:t>9. Operational Notes</w:t>
       </w:r>
       <w:bookmarkEnd w:id="16"/>
@@ -7262,10 +7938,64 @@
 <file path=word/numbering.xml><?xml version="1.0" encoding="utf-8"?>
 <w:numbering xmlns:wpc="http://schemas.microsoft.com/office/word/2010/wordprocessingCanvas" xmlns:cx="http://schemas.microsoft.com/office/drawing/2014/chartex" xmlns:cx1="http://schemas.microsoft.com/office/drawing/2015/9/8/chartex" xmlns:cx2="http://schemas.microsoft.com/office/drawing/2015/10/21/chartex" xmlns:cx3="http://schemas.microsoft.com/office/drawing/2016/5/9/chartex" xmlns:cx4="http://schemas.microsoft.com/office/drawing/2016/5/10/chartex" xmlns:cx5="http://schemas.microsoft.com/office/drawing/2016/5/11/chartex" xmlns:cx6="http://schemas.microsoft.com/office/drawing/2016/5/12/chartex" xmlns:cx7="http://schemas.microsoft.com/office/drawing/2016/5/13/chartex" xmlns:cx8="http://schemas.microsoft.com/office/drawing/2016/5/14/chartex" xmlns:mc="http://schemas.openxmlformats.org/markup-compatibility/2006" xmlns:aink="http://schemas.microsoft.com/office/drawing/2016/ink" xmlns:am3d="http://schemas.microsoft.com/office/drawing/2017/model3d" xmlns:o="urn:schemas-microsoft-com:office:office" xmlns:oel="http://schemas.microsoft.com/office/2019/extlst" xmlns:r="http://schemas.openxmlformats.org/officeDocument/2006/relationships" xmlns:m="http://schemas.openxmlformats.org/officeDocument/2006/math" xmlns:v="urn:schemas-microsoft-com:vml" xmlns:wp14="http://schemas.microsoft.com/office/word/2010/wordprocessingDrawing" xmlns:wp="http://schemas.openxmlformats.org/drawingml/2006/wordprocessingDrawing" xmlns:w10="urn:schemas-microsoft-com:office:word" xmlns:w="http://schemas.openxmlformats.org/wordprocessingml/2006/main" xmlns:w14="http://schemas.microsoft.com/office/word/2010/wordml" xmlns:w15="http://schemas.microsoft.com/office/word/2012/wordml" xmlns:w16cex="http://schemas.microsoft.com/office/word/2018/wordml/cex" xmlns:w16cid="http://schemas.microsoft.com/office/word/2016/wordml/cid" xmlns:w16="http://schemas.microsoft.com/office/word/2018/wordml" xmlns:w16du="http://schemas.microsoft.com/office/word/2023/wordml/word16du" xmlns:w16sdtdh="http://schemas.microsoft.com/office/word/2020/wordml/sdtdatahash" xmlns:w16sdtfl="http://schemas.microsoft.com/office/word/2024/wordml/sdtformatlock" xmlns:w16se="http://schemas.microsoft.com/office/word/2015/wordml/symex" xmlns:wpg="http://schemas.microsoft.com/office/word/2010/wordprocessingGroup" xmlns:wpi="http://schemas.microsoft.com/office/word/2010/wordprocessingInk" xmlns:wne="http://schemas.microsoft.com/office/word/2006/wordml" xmlns:wps="http://schemas.microsoft.com/office/word/2010/wordprocessingShape" mc:Ignorable="w14 w15 w16se w16cid w16 w16cex w16sdtdh w16sdtfl w16du wp14">
   <w:abstractNum w:abstractNumId="0" w15:restartNumberingAfterBreak="0">
-    <w:nsid w:val="46B6030D"/>
+    <w:nsid w:val="5E8B4AAB"/>
     <w:multiLevelType w:val="hybridMultilevel"/>
-    <w:tmpl w:val="C642707A"/>
-    <w:lvl w:ilvl="0" w:tplc="7F3232F8">
+    <w:tmpl w:val="84F4EA9E"/>
+    <w:lvl w:ilvl="0" w:tplc="515462E0">
+      <w:start w:val="1"/>
+      <w:numFmt w:val="bullet"/>
+      <w:lvlText w:val="•"/>
+      <w:lvlJc w:val="left"/>
+      <w:pPr>
+        <w:ind w:left="720" w:hanging="360"/>
+      </w:pPr>
+    </w:lvl>
+    <w:lvl w:ilvl="1" w:tplc="CAC0BEC4">
+      <w:numFmt w:val="decimal"/>
+      <w:lvlText w:val=""/>
+      <w:lvlJc w:val="left"/>
+    </w:lvl>
+    <w:lvl w:ilvl="2" w:tplc="FCCA6362">
+      <w:numFmt w:val="decimal"/>
+      <w:lvlText w:val=""/>
+      <w:lvlJc w:val="left"/>
+    </w:lvl>
+    <w:lvl w:ilvl="3" w:tplc="25A80154">
+      <w:numFmt w:val="decimal"/>
+      <w:lvlText w:val=""/>
+      <w:lvlJc w:val="left"/>
+    </w:lvl>
+    <w:lvl w:ilvl="4" w:tplc="3CF03FE4">
+      <w:numFmt w:val="decimal"/>
+      <w:lvlText w:val=""/>
+      <w:lvlJc w:val="left"/>
+    </w:lvl>
+    <w:lvl w:ilvl="5" w:tplc="61B6E2E2">
+      <w:numFmt w:val="decimal"/>
+      <w:lvlText w:val=""/>
+      <w:lvlJc w:val="left"/>
+    </w:lvl>
+    <w:lvl w:ilvl="6" w:tplc="7A720540">
+      <w:numFmt w:val="decimal"/>
+      <w:lvlText w:val=""/>
+      <w:lvlJc w:val="left"/>
+    </w:lvl>
+    <w:lvl w:ilvl="7" w:tplc="B980E542">
+      <w:numFmt w:val="decimal"/>
+      <w:lvlText w:val=""/>
+      <w:lvlJc w:val="left"/>
+    </w:lvl>
+    <w:lvl w:ilvl="8" w:tplc="BA7A6942">
+      <w:numFmt w:val="decimal"/>
+      <w:lvlText w:val=""/>
+      <w:lvlJc w:val="left"/>
+    </w:lvl>
+  </w:abstractNum>
+  <w:abstractNum w:abstractNumId="1" w15:restartNumberingAfterBreak="0">
+    <w:nsid w:val="6BFB5B66"/>
+    <w:multiLevelType w:val="hybridMultilevel"/>
+    <w:tmpl w:val="566A8DE6"/>
+    <w:lvl w:ilvl="0" w:tplc="5016CB6A">
       <w:start w:val="1"/>
       <w:numFmt w:val="bullet"/>
       <w:lvlText w:val="●"/>
@@ -7274,7 +8004,7 @@
         <w:ind w:left="720" w:hanging="360"/>
       </w:pPr>
     </w:lvl>
-    <w:lvl w:ilvl="1" w:tplc="AF58791C">
+    <w:lvl w:ilvl="1" w:tplc="4BF42B90">
       <w:start w:val="1"/>
       <w:numFmt w:val="bullet"/>
       <w:lvlText w:val="○"/>
@@ -7283,7 +8013,7 @@
         <w:ind w:left="1440" w:hanging="360"/>
       </w:pPr>
     </w:lvl>
-    <w:lvl w:ilvl="2" w:tplc="C6BCB272">
+    <w:lvl w:ilvl="2" w:tplc="8EFCE3FA">
       <w:start w:val="1"/>
       <w:numFmt w:val="bullet"/>
       <w:lvlText w:val="■"/>
@@ -7292,7 +8022,7 @@
         <w:ind w:left="2160" w:hanging="360"/>
       </w:pPr>
     </w:lvl>
-    <w:lvl w:ilvl="3" w:tplc="77A8C9C8">
+    <w:lvl w:ilvl="3" w:tplc="8FA6766A">
       <w:start w:val="1"/>
       <w:numFmt w:val="bullet"/>
       <w:lvlText w:val="●"/>
@@ -7301,7 +8031,7 @@
         <w:ind w:left="2880" w:hanging="360"/>
       </w:pPr>
     </w:lvl>
-    <w:lvl w:ilvl="4" w:tplc="93B88B7C">
+    <w:lvl w:ilvl="4" w:tplc="4FB67F72">
       <w:start w:val="1"/>
       <w:numFmt w:val="bullet"/>
       <w:lvlText w:val="○"/>
@@ -7310,7 +8040,7 @@
         <w:ind w:left="3600" w:hanging="360"/>
       </w:pPr>
     </w:lvl>
-    <w:lvl w:ilvl="5" w:tplc="A29CAB20">
+    <w:lvl w:ilvl="5" w:tplc="A4B66844">
       <w:start w:val="1"/>
       <w:numFmt w:val="bullet"/>
       <w:lvlText w:val="■"/>
@@ -7319,7 +8049,7 @@
         <w:ind w:left="4320" w:hanging="360"/>
       </w:pPr>
     </w:lvl>
-    <w:lvl w:ilvl="6" w:tplc="9BDE03F4">
+    <w:lvl w:ilvl="6" w:tplc="7DA46268">
       <w:start w:val="1"/>
       <w:numFmt w:val="bullet"/>
       <w:lvlText w:val="●"/>
@@ -7328,7 +8058,7 @@
         <w:ind w:left="5040" w:hanging="360"/>
       </w:pPr>
     </w:lvl>
-    <w:lvl w:ilvl="7" w:tplc="10C845B0">
+    <w:lvl w:ilvl="7" w:tplc="AA924950">
       <w:start w:val="1"/>
       <w:numFmt w:val="bullet"/>
       <w:lvlText w:val="●"/>
@@ -7337,7 +8067,7 @@
         <w:ind w:left="5760" w:hanging="360"/>
       </w:pPr>
     </w:lvl>
-    <w:lvl w:ilvl="8" w:tplc="C11AB96A">
+    <w:lvl w:ilvl="8" w:tplc="191A7118">
       <w:start w:val="1"/>
       <w:numFmt w:val="bullet"/>
       <w:lvlText w:val="●"/>
@@ -7347,68 +8077,14 @@
       </w:pPr>
     </w:lvl>
   </w:abstractNum>
-  <w:abstractNum w:abstractNumId="1" w15:restartNumberingAfterBreak="0">
-    <w:nsid w:val="6DD71F18"/>
-    <w:multiLevelType w:val="hybridMultilevel"/>
-    <w:tmpl w:val="1B20FF6A"/>
-    <w:lvl w:ilvl="0" w:tplc="4BD235F0">
-      <w:start w:val="1"/>
-      <w:numFmt w:val="bullet"/>
-      <w:lvlText w:val="•"/>
-      <w:lvlJc w:val="left"/>
-      <w:pPr>
-        <w:ind w:left="720" w:hanging="360"/>
-      </w:pPr>
-    </w:lvl>
-    <w:lvl w:ilvl="1" w:tplc="C16A7AAE">
-      <w:numFmt w:val="decimal"/>
-      <w:lvlText w:val=""/>
-      <w:lvlJc w:val="left"/>
-    </w:lvl>
-    <w:lvl w:ilvl="2" w:tplc="DC0C454C">
-      <w:numFmt w:val="decimal"/>
-      <w:lvlText w:val=""/>
-      <w:lvlJc w:val="left"/>
-    </w:lvl>
-    <w:lvl w:ilvl="3" w:tplc="05CA695A">
-      <w:numFmt w:val="decimal"/>
-      <w:lvlText w:val=""/>
-      <w:lvlJc w:val="left"/>
-    </w:lvl>
-    <w:lvl w:ilvl="4" w:tplc="291EC878">
-      <w:numFmt w:val="decimal"/>
-      <w:lvlText w:val=""/>
-      <w:lvlJc w:val="left"/>
-    </w:lvl>
-    <w:lvl w:ilvl="5" w:tplc="3B48B7F0">
-      <w:numFmt w:val="decimal"/>
-      <w:lvlText w:val=""/>
-      <w:lvlJc w:val="left"/>
-    </w:lvl>
-    <w:lvl w:ilvl="6" w:tplc="F0CEBB9E">
-      <w:numFmt w:val="decimal"/>
-      <w:lvlText w:val=""/>
-      <w:lvlJc w:val="left"/>
-    </w:lvl>
-    <w:lvl w:ilvl="7" w:tplc="3C54DCB4">
-      <w:numFmt w:val="decimal"/>
-      <w:lvlText w:val=""/>
-      <w:lvlJc w:val="left"/>
-    </w:lvl>
-    <w:lvl w:ilvl="8" w:tplc="8E749600">
-      <w:numFmt w:val="decimal"/>
-      <w:lvlText w:val=""/>
-      <w:lvlJc w:val="left"/>
-    </w:lvl>
-  </w:abstractNum>
-  <w:num w:numId="1" w16cid:durableId="1139953431">
-    <w:abstractNumId w:val="0"/>
+  <w:num w:numId="1" w16cid:durableId="492112013">
+    <w:abstractNumId w:val="1"/>
     <w:lvlOverride w:ilvl="0">
       <w:startOverride w:val="1"/>
     </w:lvlOverride>
   </w:num>
-  <w:num w:numId="2" w16cid:durableId="1384791677">
-    <w:abstractNumId w:val="1"/>
+  <w:num w:numId="2" w16cid:durableId="993799301">
+    <w:abstractNumId w:val="0"/>
     <w:lvlOverride w:ilvl="0">
       <w:startOverride w:val="1"/>
     </w:lvlOverride>
@@ -8026,7 +8702,7 @@
     <w:autoRedefine/>
     <w:uiPriority w:val="39"/>
     <w:unhideWhenUsed/>
-    <w:rsid w:val="00EF1ADE"/>
+    <w:rsid w:val="008E7F0E"/>
     <w:pPr>
       <w:spacing w:after="100"/>
     </w:pPr>
@@ -8038,7 +8714,7 @@
     <w:autoRedefine/>
     <w:uiPriority w:val="39"/>
     <w:unhideWhenUsed/>
-    <w:rsid w:val="00EF1ADE"/>
+    <w:rsid w:val="008E7F0E"/>
     <w:pPr>
       <w:spacing w:after="100"/>
       <w:ind w:left="220"/>

</xml_diff>